<commit_message>
docs(design)+trio: V0.1.1 energy-flow screen design, menu entry, task plan
- detailed design md+docx: V1.0 -> V0.1.1, upstream ref V0.1.1, Siemens China,
  4.4 adds emLedgerQuery + flow data contract, 5.2/5.3/5.4/appendix-B flow entries
- model check: no new defs needed (submeterOf is ph-standard; emDepth/emChildCount are query-time columns)
- lib/menu.trio: add flow menu entry (/flow, order -315.5)
- plans/2026-09-16-energy-flow.md: phase checklist, phase 3 pending confirmation
- Phase 2 of gated plan; no frontend code yet
</commit_message>
<xml_diff>
--- a/docs/designdoc/energyMatrix-fin-pod-detailed-design.docx
+++ b/docs/designdoc/energyMatrix-fin-pod-detailed-design.docx
@@ -96,7 +96,7 @@
           <w:sz w:val="22"/>
           <w:szCs w:val="22"/>
         </w:rPr>
-        <w:t xml:space="preserve">版本 V1.0</w:t>
+        <w:t>版本 V0.1.1</w:t>
       </w:r>
     </w:p>
     <w:p>
@@ -111,7 +111,7 @@
           <w:sz w:val="22"/>
           <w:szCs w:val="22"/>
         </w:rPr>
-        <w:t xml:space="preserve">和碳技术（南京）有限公司</w:t>
+        <w:t>西门子中国</w:t>
       </w:r>
     </w:p>
     <w:p>
@@ -385,6 +385,26 @@
             <w:vAlign w:val="center"/>
           </w:tcPr>
           <w:p>
+            <w:r>
+              <w:t>V0.1.1</w:t>
+            </w:r>
+          </w:p>
+        </w:tc>
+      </w:tr>
+      <w:tr>
+        <w:tc>
+          <w:tcPr>
+            <w:tcW w:type="dxa" w:w="1800"/>
+            <w:shd w:fill="F7FAFC" w:val="clear"/>
+            <w:tcMar>
+              <w:top w:type="dxa" w:w="60"/>
+              <w:left w:type="dxa" w:w="100"/>
+              <w:bottom w:type="dxa" w:w="60"/>
+              <w:right w:type="dxa" w:w="100"/>
+            </w:tcMar>
+            <w:vAlign w:val="center"/>
+          </w:tcPr>
+          <w:p>
             <w:pPr>
               <w:spacing w:after="0" w:before="0" w:line="250"/>
             </w:pPr>
@@ -395,7 +415,34 @@
                 <w:sz w:val="17"/>
                 <w:szCs w:val="17"/>
               </w:rPr>
-              <w:t xml:space="preserve">V1.0</w:t>
+              <w:t xml:space="preserve">密级</w:t>
+            </w:r>
+          </w:p>
+        </w:tc>
+        <w:tc>
+          <w:tcPr>
+            <w:tcW w:type="dxa" w:w="7200"/>
+            <w:shd w:fill="F7FAFC" w:val="clear"/>
+            <w:tcMar>
+              <w:top w:type="dxa" w:w="60"/>
+              <w:left w:type="dxa" w:w="100"/>
+              <w:bottom w:type="dxa" w:w="60"/>
+              <w:right w:type="dxa" w:w="100"/>
+            </w:tcMar>
+            <w:vAlign w:val="center"/>
+          </w:tcPr>
+          <w:p>
+            <w:pPr>
+              <w:spacing w:after="0" w:before="0" w:line="250"/>
+            </w:pPr>
+            <w:r>
+              <w:rPr>
+                <w:rFonts w:ascii="Microsoft YaHei" w:cs="Microsoft YaHei" w:eastAsia="Microsoft YaHei" w:hAnsi="Microsoft YaHei"/>
+                <w:color w:val="1F2933"/>
+                <w:sz w:val="17"/>
+                <w:szCs w:val="17"/>
+              </w:rPr>
+              <w:t xml:space="preserve">公司内部</w:t>
             </w:r>
           </w:p>
         </w:tc>
@@ -404,7 +451,7 @@
         <w:tc>
           <w:tcPr>
             <w:tcW w:type="dxa" w:w="1800"/>
-            <w:shd w:fill="F7FAFC" w:val="clear"/>
+            <w:shd w:fill="FFFFFF" w:val="clear"/>
             <w:tcMar>
               <w:top w:type="dxa" w:w="60"/>
               <w:left w:type="dxa" w:w="100"/>
@@ -424,14 +471,14 @@
                 <w:sz w:val="17"/>
                 <w:szCs w:val="17"/>
               </w:rPr>
-              <w:t xml:space="preserve">密级</w:t>
+              <w:t xml:space="preserve">上游文档</w:t>
             </w:r>
           </w:p>
         </w:tc>
         <w:tc>
           <w:tcPr>
             <w:tcW w:type="dxa" w:w="7200"/>
-            <w:shd w:fill="F7FAFC" w:val="clear"/>
+            <w:shd w:fill="FFFFFF" w:val="clear"/>
             <w:tcMar>
               <w:top w:type="dxa" w:w="60"/>
               <w:left w:type="dxa" w:w="100"/>
@@ -451,7 +498,7 @@
                 <w:sz w:val="17"/>
                 <w:szCs w:val="17"/>
               </w:rPr>
-              <w:t xml:space="preserve">公司内部</w:t>
+              <w:t>AI4B-EM-DS-2026-001《energyMatrix 语义模型设计说明书》V0.1.1</w:t>
             </w:r>
           </w:p>
         </w:tc>
@@ -460,7 +507,7 @@
         <w:tc>
           <w:tcPr>
             <w:tcW w:type="dxa" w:w="1800"/>
-            <w:shd w:fill="FFFFFF" w:val="clear"/>
+            <w:shd w:fill="F7FAFC" w:val="clear"/>
             <w:tcMar>
               <w:top w:type="dxa" w:w="60"/>
               <w:left w:type="dxa" w:w="100"/>
@@ -480,14 +527,14 @@
                 <w:sz w:val="17"/>
                 <w:szCs w:val="17"/>
               </w:rPr>
-              <w:t xml:space="preserve">上游文档</w:t>
+              <w:t xml:space="preserve">覆盖范围</w:t>
             </w:r>
           </w:p>
         </w:tc>
         <w:tc>
           <w:tcPr>
             <w:tcW w:type="dxa" w:w="7200"/>
-            <w:shd w:fill="FFFFFF" w:val="clear"/>
+            <w:shd w:fill="F7FAFC" w:val="clear"/>
             <w:tcMar>
               <w:top w:type="dxa" w:w="60"/>
               <w:left w:type="dxa" w:w="100"/>
@@ -507,7 +554,7 @@
                 <w:sz w:val="17"/>
                 <w:szCs w:val="17"/>
               </w:rPr>
-              <w:t xml:space="preserve">AI4B-EM-DS-2026-001《energyMatrix 语义模型设计说明书》V1.0</w:t>
+              <w:t xml:space="preserve">数据接口设计、Fantom 后台类设计、前端路由与功能设计、部署与关键流程时序</w:t>
             </w:r>
           </w:p>
         </w:tc>
@@ -516,7 +563,7 @@
         <w:tc>
           <w:tcPr>
             <w:tcW w:type="dxa" w:w="1800"/>
-            <w:shd w:fill="F7FAFC" w:val="clear"/>
+            <w:shd w:fill="FFFFFF" w:val="clear"/>
             <w:tcMar>
               <w:top w:type="dxa" w:w="60"/>
               <w:left w:type="dxa" w:w="100"/>
@@ -536,14 +583,14 @@
                 <w:sz w:val="17"/>
                 <w:szCs w:val="17"/>
               </w:rPr>
-              <w:t xml:space="preserve">覆盖范围</w:t>
+              <w:t xml:space="preserve">不覆盖范围</w:t>
             </w:r>
           </w:p>
         </w:tc>
         <w:tc>
           <w:tcPr>
             <w:tcW w:type="dxa" w:w="7200"/>
-            <w:shd w:fill="F7FAFC" w:val="clear"/>
+            <w:shd w:fill="FFFFFF" w:val="clear"/>
             <w:tcMar>
               <w:top w:type="dxa" w:w="60"/>
               <w:left w:type="dxa" w:w="100"/>
@@ -563,7 +610,7 @@
                 <w:sz w:val="17"/>
                 <w:szCs w:val="17"/>
               </w:rPr>
-              <w:t xml:space="preserve">数据接口设计、Fantom 后台类设计、前端路由与功能设计、部署与关键流程时序</w:t>
+              <w:t xml:space="preserve">语义模型定义（见上游文档）、控制逻辑与寻优算法（见 CoolMatrix / heatMatrix 设计说明）、UI 视觉规范（见界面设计说明）</w:t>
             </w:r>
           </w:p>
         </w:tc>
@@ -572,7 +619,7 @@
         <w:tc>
           <w:tcPr>
             <w:tcW w:type="dxa" w:w="1800"/>
-            <w:shd w:fill="FFFFFF" w:val="clear"/>
+            <w:shd w:fill="F7FAFC" w:val="clear"/>
             <w:tcMar>
               <w:top w:type="dxa" w:w="60"/>
               <w:left w:type="dxa" w:w="100"/>
@@ -592,14 +639,14 @@
                 <w:sz w:val="17"/>
                 <w:szCs w:val="17"/>
               </w:rPr>
-              <w:t xml:space="preserve">不覆盖范围</w:t>
+              <w:t xml:space="preserve">技术栈</w:t>
             </w:r>
           </w:p>
         </w:tc>
         <w:tc>
           <w:tcPr>
             <w:tcW w:type="dxa" w:w="7200"/>
-            <w:shd w:fill="FFFFFF" w:val="clear"/>
+            <w:shd w:fill="F7FAFC" w:val="clear"/>
             <w:tcMar>
               <w:top w:type="dxa" w:w="60"/>
               <w:left w:type="dxa" w:w="100"/>
@@ -619,7 +666,7 @@
                 <w:sz w:val="17"/>
                 <w:szCs w:val="17"/>
               </w:rPr>
-              <w:t xml:space="preserve">语义模型定义（见上游文档）、控制逻辑与寻优算法（见 CoolMatrix / heatMatrix 设计说明）、UI 视觉规范（见界面设计说明）</w:t>
+              <w:t xml:space="preserve">Fantom / FIN Framework 5.x / Haxall · Xeto 5.0 · React 18 + TypeScript · Folio</w:t>
             </w:r>
           </w:p>
         </w:tc>
@@ -628,7 +675,7 @@
         <w:tc>
           <w:tcPr>
             <w:tcW w:type="dxa" w:w="1800"/>
-            <w:shd w:fill="F7FAFC" w:val="clear"/>
+            <w:shd w:fill="FFFFFF" w:val="clear"/>
             <w:tcMar>
               <w:top w:type="dxa" w:w="60"/>
               <w:left w:type="dxa" w:w="100"/>
@@ -648,14 +695,14 @@
                 <w:sz w:val="17"/>
                 <w:szCs w:val="17"/>
               </w:rPr>
-              <w:t xml:space="preserve">技术栈</w:t>
+              <w:t xml:space="preserve">编制单位</w:t>
             </w:r>
           </w:p>
         </w:tc>
         <w:tc>
           <w:tcPr>
             <w:tcW w:type="dxa" w:w="7200"/>
-            <w:shd w:fill="F7FAFC" w:val="clear"/>
+            <w:shd w:fill="FFFFFF" w:val="clear"/>
             <w:tcMar>
               <w:top w:type="dxa" w:w="60"/>
               <w:left w:type="dxa" w:w="100"/>
@@ -675,63 +722,7 @@
                 <w:sz w:val="17"/>
                 <w:szCs w:val="17"/>
               </w:rPr>
-              <w:t xml:space="preserve">Fantom / FIN Framework 5.x / Haxall · Xeto 5.0 · React 18 + TypeScript · Folio</w:t>
-            </w:r>
-          </w:p>
-        </w:tc>
-      </w:tr>
-      <w:tr>
-        <w:tc>
-          <w:tcPr>
-            <w:tcW w:type="dxa" w:w="1800"/>
-            <w:shd w:fill="FFFFFF" w:val="clear"/>
-            <w:tcMar>
-              <w:top w:type="dxa" w:w="60"/>
-              <w:left w:type="dxa" w:w="100"/>
-              <w:bottom w:type="dxa" w:w="60"/>
-              <w:right w:type="dxa" w:w="100"/>
-            </w:tcMar>
-            <w:vAlign w:val="center"/>
-          </w:tcPr>
-          <w:p>
-            <w:pPr>
-              <w:spacing w:after="0" w:before="0" w:line="250"/>
-            </w:pPr>
-            <w:r>
-              <w:rPr>
-                <w:rFonts w:ascii="Microsoft YaHei" w:cs="Microsoft YaHei" w:eastAsia="Microsoft YaHei" w:hAnsi="Microsoft YaHei"/>
-                <w:color w:val="1F2933"/>
-                <w:sz w:val="17"/>
-                <w:szCs w:val="17"/>
-              </w:rPr>
-              <w:t xml:space="preserve">编制单位</w:t>
-            </w:r>
-          </w:p>
-        </w:tc>
-        <w:tc>
-          <w:tcPr>
-            <w:tcW w:type="dxa" w:w="7200"/>
-            <w:shd w:fill="FFFFFF" w:val="clear"/>
-            <w:tcMar>
-              <w:top w:type="dxa" w:w="60"/>
-              <w:left w:type="dxa" w:w="100"/>
-              <w:bottom w:type="dxa" w:w="60"/>
-              <w:right w:type="dxa" w:w="100"/>
-            </w:tcMar>
-            <w:vAlign w:val="center"/>
-          </w:tcPr>
-          <w:p>
-            <w:pPr>
-              <w:spacing w:after="0" w:before="0" w:line="250"/>
-            </w:pPr>
-            <w:r>
-              <w:rPr>
-                <w:rFonts w:ascii="Microsoft YaHei" w:cs="Microsoft YaHei" w:eastAsia="Microsoft YaHei" w:hAnsi="Microsoft YaHei"/>
-                <w:color w:val="1F2933"/>
-                <w:sz w:val="17"/>
-                <w:szCs w:val="17"/>
-              </w:rPr>
-              <w:t xml:space="preserve">和碳技术（南京）有限公司 · ai4building</w:t>
+              <w:t>西门子中国 · ai4building</w:t>
             </w:r>
           </w:p>
         </w:tc>
@@ -1123,6 +1114,48 @@
                 <w:szCs w:val="17"/>
               </w:rPr>
               <w:t xml:space="preserve">架构组</w:t>
+            </w:r>
+          </w:p>
+        </w:tc>
+      </w:tr>
+      <w:tr>
+        <w:tc>
+          <w:tcPr>
+            <w:tcW w:type="dxa" w:w="1080"/>
+          </w:tcPr>
+          <w:p>
+            <w:r>
+              <w:t>V0.1.1</w:t>
+            </w:r>
+          </w:p>
+        </w:tc>
+        <w:tc>
+          <w:tcPr>
+            <w:tcW w:type="dxa" w:w="1620"/>
+          </w:tcPr>
+          <w:p>
+            <w:r>
+              <w:t>2026-09</w:t>
+            </w:r>
+          </w:p>
+        </w:tc>
+        <w:tc>
+          <w:tcPr>
+            <w:tcW w:type="dxa" w:w="4680"/>
+          </w:tcPr>
+          <w:p>
+            <w:r>
+              <w:t>新增能流图（Sankey）屏设计；版本统一为 0.1.1；公司主体变更为西门子中国</w:t>
+            </w:r>
+          </w:p>
+        </w:tc>
+        <w:tc>
+          <w:tcPr>
+            <w:tcW w:type="dxa" w:w="1620"/>
+          </w:tcPr>
+          <w:p>
+            <w:r>
+              <w:t>架构组</w:t>
             </w:r>
           </w:p>
         </w:tc>
@@ -17270,6 +17303,62 @@
         <w:tc>
           <w:tcPr>
             <w:tcW w:type="dxa" w:w="1800"/>
+            <w:shd w:fill="F7FAFC" w:val="clear"/>
+            <w:tcMar>
+              <w:top w:type="dxa" w:w="60"/>
+              <w:left w:type="dxa" w:w="100"/>
+              <w:bottom w:type="dxa" w:w="60"/>
+              <w:right w:type="dxa" w:w="100"/>
+            </w:tcMar>
+            <w:vAlign w:val="center"/>
+          </w:tcPr>
+          <w:p>
+            <w:r>
+              <w:t>emLedgerQuery</w:t>
+            </w:r>
+          </w:p>
+        </w:tc>
+        <w:tc>
+          <w:tcPr>
+            <w:tcW w:type="dxa" w:w="3960"/>
+            <w:shd w:fill="F7FAFC" w:val="clear"/>
+            <w:tcMar>
+              <w:top w:type="dxa" w:w="60"/>
+              <w:left w:type="dxa" w:w="100"/>
+              <w:bottom w:type="dxa" w:w="60"/>
+              <w:right w:type="dxa" w:w="100"/>
+            </w:tcMar>
+            <w:vAlign w:val="center"/>
+          </w:tcPr>
+          <w:p>
+            <w:r>
+              <w:t>(siteRef, span, dim) → Grid</w:t>
+            </w:r>
+          </w:p>
+        </w:tc>
+        <w:tc>
+          <w:tcPr>
+            <w:tcW w:type="dxa" w:w="3240"/>
+            <w:shd w:fill="F7FAFC" w:val="clear"/>
+            <w:tcMar>
+              <w:top w:type="dxa" w:w="60"/>
+              <w:left w:type="dxa" w:w="100"/>
+              <w:bottom w:type="dxa" w:w="60"/>
+              <w:right w:type="dxa" w:w="100"/>
+            </w:tcMar>
+            <w:vAlign w:val="center"/>
+          </w:tcPr>
+          <w:p>
+            <w:r>
+              <w:t>台账多维聚合查询，dim 取 meter 时供能流图取值</w:t>
+            </w:r>
+          </w:p>
+        </w:tc>
+      </w:tr>
+      <w:tr>
+        <w:tc>
+          <w:tcPr>
+            <w:tcW w:type="dxa" w:w="1800"/>
             <w:shd w:fill="FFFFFF" w:val="clear"/>
             <w:tcMar>
               <w:top w:type="dxa" w:w="60"/>
@@ -17445,7 +17534,12 @@
           <w:sz w:val="17"/>
           <w:szCs w:val="17"/>
         </w:rPr>
-        <w:t xml:space="preserve">表 4-3  Axon 函数库（20 项）</w:t>
+        <w:t>表 4-3  Axon 函数库（21 项）</w:t>
+      </w:r>
+    </w:p>
+    <w:p>
+      <w:r>
+        <w:t>能流图（Sankey，V0.1.1 新增，见 5.3）数据契约：结构取自 emMeterTree（列：id、dis、emMedium、emMeterRole、submeterOf、emDepth、emVirtual、emGap、emChildCount），数值取自 emLedgerQuery（dim 取 meter）。只读，不新增 Axon 函数、不新增后端接口。</w:t>
       </w:r>
     </w:p>
     <w:p>
@@ -19289,7 +19383,7 @@
           <w:sz w:val="21"/>
           <w:szCs w:val="21"/>
         </w:rPr>
-        <w:t xml:space="preserve">路由以 /em 为前缀，九个一级模块，二级路由承载详情与子视图。全量清单见附录 B。</w:t>
+        <w:t>路由以 /em 为前缀，十个一级模块，二级路由承载详情与子视图。全量清单见附录 B。</w:t>
       </w:r>
     </w:p>
     <w:tbl>
@@ -19627,7 +19721,7 @@
                 <w:sz w:val="16"/>
                 <w:szCs w:val="16"/>
               </w:rPr>
-              <w:t xml:space="preserve">    /meters-import  /permissions  /schedules</w:t>
+              <w:t xml:space="preserve">    /meters-import  /permissions  /schedules /flow 能流图（Sankey）</w:t>
             </w:r>
           </w:p>
         </w:tc>
@@ -19895,6 +19989,80 @@
                 <w:szCs w:val="16"/>
               </w:rPr>
               <w:t xml:space="preserve">缺口以独立断流呈现，不并入任一分项</w:t>
+            </w:r>
+          </w:p>
+        </w:tc>
+      </w:tr>
+      <w:tr>
+        <w:tc>
+          <w:tcPr>
+            <w:tcW w:type="dxa" w:w="1080"/>
+            <w:shd w:fill="FFFFFF" w:val="clear"/>
+            <w:tcMar>
+              <w:top w:type="dxa" w:w="60"/>
+              <w:left w:type="dxa" w:w="100"/>
+              <w:bottom w:type="dxa" w:w="60"/>
+              <w:right w:type="dxa" w:w="100"/>
+            </w:tcMar>
+            <w:vAlign w:val="center"/>
+          </w:tcPr>
+          <w:p>
+            <w:r>
+              <w:t>能流图</w:t>
+            </w:r>
+          </w:p>
+        </w:tc>
+        <w:tc>
+          <w:tcPr>
+            <w:tcW w:type="dxa" w:w="2700"/>
+            <w:shd w:fill="FFFFFF" w:val="clear"/>
+            <w:tcMar>
+              <w:top w:type="dxa" w:w="60"/>
+              <w:left w:type="dxa" w:w="100"/>
+              <w:bottom w:type="dxa" w:w="60"/>
+              <w:right w:type="dxa" w:w="100"/>
+            </w:tcMar>
+            <w:vAlign w:val="center"/>
+          </w:tcPr>
+          <w:p>
+            <w:r>
+              <w:t>能源流向 Sankey、按介质分色、缺口断流汇入不明用能、tooltip 表计名与能耗</w:t>
+            </w:r>
+          </w:p>
+        </w:tc>
+        <w:tc>
+          <w:tcPr>
+            <w:tcW w:type="dxa" w:w="1440"/>
+            <w:shd w:fill="FFFFFF" w:val="clear"/>
+            <w:tcMar>
+              <w:top w:type="dxa" w:w="60"/>
+              <w:left w:type="dxa" w:w="100"/>
+              <w:bottom w:type="dxa" w:w="60"/>
+              <w:right w:type="dxa" w:w="100"/>
+            </w:tcMar>
+            <w:vAlign w:val="center"/>
+          </w:tcPr>
+          <w:p>
+            <w:r>
+              <w:t>无</w:t>
+            </w:r>
+          </w:p>
+        </w:tc>
+        <w:tc>
+          <w:tcPr>
+            <w:tcW w:type="dxa" w:w="3780"/>
+            <w:shd w:fill="FFFFFF" w:val="clear"/>
+            <w:tcMar>
+              <w:top w:type="dxa" w:w="60"/>
+              <w:left w:type="dxa" w:w="100"/>
+              <w:bottom w:type="dxa" w:w="60"/>
+              <w:right w:type="dxa" w:w="100"/>
+            </w:tcMar>
+            <w:vAlign w:val="center"/>
+          </w:tcPr>
+          <w:p>
+            <w:r>
+              <w:t>流向宽度取 L2 台账合计；考核表不参与汇总；空台账给引导不白屏</w:t>
             </w:r>
           </w:p>
         </w:tc>
@@ -21433,6 +21601,11 @@
           <w:szCs w:val="17"/>
         </w:rPr>
         <w:t xml:space="preserve">表 5-2  数据获取与缓存策略</w:t>
+      </w:r>
+    </w:p>
+    <w:p>
+      <w:r>
+        <w:t>能流图前端取数契约（emApi 薄封装，V0.1.1）：emMeterTree(siteRef) 取结构、emLedgerAggregate(siteRef, span, "meter") 取量值，mobx Store 内合并后经纯函数 buildSankey 转为 recharts Sankey 的 {nodes, links}。</w:t>
       </w:r>
     </w:p>
     <w:p>
@@ -34448,6 +34621,48 @@
           </w:p>
         </w:tc>
       </w:tr>
+      <w:tr>
+        <w:tc>
+          <w:tcPr>
+            <w:tcW w:type="dxa" w:w="2340"/>
+          </w:tcPr>
+          <w:p>
+            <w:r>
+              <w:t>/em/flow</w:t>
+            </w:r>
+          </w:p>
+        </w:tc>
+        <w:tc>
+          <w:tcPr>
+            <w:tcW w:type="dxa" w:w="2160"/>
+          </w:tcPr>
+          <w:p>
+            <w:r>
+              <w:t>FlowPage</w:t>
+            </w:r>
+          </w:p>
+        </w:tc>
+        <w:tc>
+          <w:tcPr>
+            <w:tcW w:type="dxa" w:w="1260"/>
+          </w:tcPr>
+          <w:p>
+            <w:r>
+              <w:t>em:read</w:t>
+            </w:r>
+          </w:p>
+        </w:tc>
+        <w:tc>
+          <w:tcPr>
+            <w:tcW w:type="dxa" w:w="3240"/>
+          </w:tcPr>
+          <w:p>
+            <w:r>
+              <w:t>能流图（Sankey），流向带宽∝台账能耗</w:t>
+            </w:r>
+          </w:p>
+        </w:tc>
+      </w:tr>
     </w:tbl>
     <w:sectPr>
       <w:footerReference w:type="default" r:id="rId7"/>

</xml_diff>

<commit_message>
docs(design)+model+trio: V0.1.2 核心KPI考核屏设计定稿 — EmSite增emBeds且UI可配置, 菜单加/kpi, 后端零新增
</commit_message>
<xml_diff>
--- a/docs/designdoc/energyMatrix-fin-pod-detailed-design.docx
+++ b/docs/designdoc/energyMatrix-fin-pod-detailed-design.docx
@@ -90,13 +90,7 @@
         <w:jc w:val="center"/>
       </w:pPr>
       <w:r>
-        <w:rPr>
-          <w:rFonts w:ascii="Microsoft YaHei" w:cs="Microsoft YaHei" w:eastAsia="Microsoft YaHei" w:hAnsi="Microsoft YaHei"/>
-          <w:color w:val="5B6B7A"/>
-          <w:sz w:val="22"/>
-          <w:szCs w:val="22"/>
-        </w:rPr>
-        <w:t>版本 V0.1.1</w:t>
+        <w:t>版本 V0.1.2</w:t>
       </w:r>
     </w:p>
     <w:p>
@@ -386,7 +380,7 @@
           </w:tcPr>
           <w:p>
             <w:r>
-              <w:t>V0.1.1</w:t>
+              <w:t>V0.1.2</w:t>
             </w:r>
           </w:p>
         </w:tc>
@@ -492,13 +486,7 @@
               <w:spacing w:after="0" w:before="0" w:line="250"/>
             </w:pPr>
             <w:r>
-              <w:rPr>
-                <w:rFonts w:ascii="Microsoft YaHei" w:cs="Microsoft YaHei" w:eastAsia="Microsoft YaHei" w:hAnsi="Microsoft YaHei"/>
-                <w:color w:val="1F2933"/>
-                <w:sz w:val="17"/>
-                <w:szCs w:val="17"/>
-              </w:rPr>
-              <w:t>AI4B-EM-DS-2026-001《energyMatrix 语义模型设计说明书》V0.1.1</w:t>
+              <w:t>AI4B-EM-DS-2026-001《energyMatrix 语义模型设计说明书》V0.1.2</w:t>
             </w:r>
           </w:p>
         </w:tc>
@@ -1146,6 +1134,48 @@
           <w:p>
             <w:r>
               <w:t>新增能流图（Sankey）屏设计；版本统一为 0.1.1；公司主体变更为西门子中国</w:t>
+            </w:r>
+          </w:p>
+        </w:tc>
+        <w:tc>
+          <w:tcPr>
+            <w:tcW w:type="dxa" w:w="1620"/>
+          </w:tcPr>
+          <w:p>
+            <w:r>
+              <w:t>架构组</w:t>
+            </w:r>
+          </w:p>
+        </w:tc>
+      </w:tr>
+      <w:tr>
+        <w:tc>
+          <w:tcPr>
+            <w:tcW w:type="dxa" w:w="1080"/>
+          </w:tcPr>
+          <w:p>
+            <w:r>
+              <w:t>V0.1.2</w:t>
+            </w:r>
+          </w:p>
+        </w:tc>
+        <w:tc>
+          <w:tcPr>
+            <w:tcW w:type="dxa" w:w="1620"/>
+          </w:tcPr>
+          <w:p>
+            <w:r>
+              <w:t>2026-09</w:t>
+            </w:r>
+          </w:p>
+        </w:tc>
+        <w:tc>
+          <w:tcPr>
+            <w:tcW w:type="dxa" w:w="4680"/>
+          </w:tcPr>
+          <w:p>
+            <w:r>
+              <w:t>新增核心 KPI 考核屏（/kpi）设计：复用 emKpiDefs/emKpiComputeAll/emQuotaProgressAll，站点模型新增 emBeds（核定床位数）且参数 UI 可配置；版本统一为 0.1.2</w:t>
             </w:r>
           </w:p>
         </w:tc>
@@ -17543,6 +17573,11 @@
       </w:r>
     </w:p>
     <w:p>
+      <w:r>
+        <w:t>KPI 考核（V0.1.2 新增，见 5.3）数据契约：指标定义取自 emKpiDefs()（emKpiCode、dis、emFormula、unit、emGranularity、emDimension、emHigherIsBetter、emStandardRef），数值批量取自 emKpiComputeAll(kpiCode, [subjectRef...], span)（emFormula 走 Axon 求值，分母缺失返回 null 不当 0），定额进度取自 emQuotas(subjectRef) 与 emQuotaProgressAll(subjectRef, span)。站点考核参数（area、emCoolArea、emOccupancy、emBeds）由模型配置屏经通用写接口 emEntityUpdate(entityId, changes) 维护（admin、枚举校验、留审计）。KPI 屏只读，不新增 Axon 函数、不新增后端接口。</w:t>
+      </w:r>
+    </w:p>
+    <w:p>
       <w:pPr>
         <w:pStyle w:val="Heading2"/>
         <w:spacing w:after="120" w:before="260"/>
@@ -19724,6 +19759,14 @@
               <w:t xml:space="preserve">    /meters-import  /permissions  /schedules /flow 能流图（Sankey）</w:t>
             </w:r>
           </w:p>
+          <w:p>
+            <w:pPr>
+              <w:spacing w:after="0" w:before="0" w:line="250"/>
+            </w:pPr>
+            <w:r>
+              <w:t>/kpi                         KPI 考核（核心指标 + 定额进度）</w:t>
+            </w:r>
+          </w:p>
         </w:tc>
       </w:tr>
     </w:tbl>
@@ -20063,6 +20106,80 @@
           <w:p>
             <w:r>
               <w:t>流向宽度取 L2 台账合计；考核表不参与汇总；空台账给引导不白屏</w:t>
+            </w:r>
+          </w:p>
+        </w:tc>
+      </w:tr>
+      <w:tr>
+        <w:tc>
+          <w:tcPr>
+            <w:tcW w:type="dxa" w:w="1080"/>
+            <w:shd w:fill="FFFFFF" w:val="clear"/>
+            <w:tcMar>
+              <w:top w:type="dxa" w:w="60"/>
+              <w:left w:type="dxa" w:w="100"/>
+              <w:bottom w:type="dxa" w:w="60"/>
+              <w:right w:type="dxa" w:w="100"/>
+            </w:tcMar>
+            <w:vAlign w:val="center"/>
+          </w:tcPr>
+          <w:p>
+            <w:r>
+              <w:t>KPI 考核</w:t>
+            </w:r>
+          </w:p>
+        </w:tc>
+        <w:tc>
+          <w:tcPr>
+            <w:tcW w:type="dxa" w:w="2700"/>
+            <w:shd w:fill="FFFFFF" w:val="clear"/>
+            <w:tcMar>
+              <w:top w:type="dxa" w:w="60"/>
+              <w:left w:type="dxa" w:w="100"/>
+              <w:bottom w:type="dxa" w:w="60"/>
+              <w:right w:type="dxa" w:w="100"/>
+            </w:tcMar>
+            <w:vAlign w:val="center"/>
+          </w:tcPr>
+          <w:p>
+            <w:r>
+              <w:t>核心指标卡（单位面积能耗/电耗、人均能耗/水耗、单位床位能耗、碳强度）、定额进度对标、绿色医院评审数据支撑</w:t>
+            </w:r>
+          </w:p>
+        </w:tc>
+        <w:tc>
+          <w:tcPr>
+            <w:tcW w:type="dxa" w:w="1440"/>
+            <w:shd w:fill="FFFFFF" w:val="clear"/>
+            <w:tcMar>
+              <w:top w:type="dxa" w:w="60"/>
+              <w:left w:type="dxa" w:w="100"/>
+              <w:bottom w:type="dxa" w:w="60"/>
+              <w:right w:type="dxa" w:w="100"/>
+            </w:tcMar>
+            <w:vAlign w:val="center"/>
+          </w:tcPr>
+          <w:p>
+            <w:r>
+              <w:t>无</w:t>
+            </w:r>
+          </w:p>
+        </w:tc>
+        <w:tc>
+          <w:tcPr>
+            <w:tcW w:type="dxa" w:w="3780"/>
+            <w:shd w:fill="FFFFFF" w:val="clear"/>
+            <w:tcMar>
+              <w:top w:type="dxa" w:w="60"/>
+              <w:left w:type="dxa" w:w="100"/>
+              <w:bottom w:type="dxa" w:w="60"/>
+              <w:right w:type="dxa" w:w="100"/>
+            </w:tcMar>
+            <w:vAlign w:val="center"/>
+          </w:tcPr>
+          <w:p>
+            <w:r>
+              <w:t>分母缺失显示「—」并引导至模型配置屏；参数可配置（emBeds 等站点属性）</w:t>
             </w:r>
           </w:p>
         </w:tc>
@@ -21606,6 +21723,11 @@
     <w:p>
       <w:r>
         <w:t>能流图前端取数契约（emApi 薄封装，V0.1.1）：emMeterTree(siteRef) 取结构、emLedgerAggregate(siteRef, span, "meter") 取量值，mobx Store 内合并后经纯函数 buildSankey 转为 recharts Sankey 的 {nodes, links}。</w:t>
+      </w:r>
+    </w:p>
+    <w:p>
+      <w:r>
+        <w:t>KPI 考核前端取数契约（emApi 薄封装，V0.1.2）：emKpiDefs() 取指标定义、emKpiComputeAll(code, [site], span) 批量取值、emQuotaProgressAll(site, span) 取定额进度；分母缺失的指标显示「—」不当 0。</w:t>
       </w:r>
     </w:p>
     <w:p>
@@ -34663,6 +34785,48 @@
           </w:p>
         </w:tc>
       </w:tr>
+      <w:tr>
+        <w:tc>
+          <w:tcPr>
+            <w:tcW w:type="dxa" w:w="2340"/>
+          </w:tcPr>
+          <w:p>
+            <w:r>
+              <w:t>/em/kpi</w:t>
+            </w:r>
+          </w:p>
+        </w:tc>
+        <w:tc>
+          <w:tcPr>
+            <w:tcW w:type="dxa" w:w="2160"/>
+          </w:tcPr>
+          <w:p>
+            <w:r>
+              <w:t>KpiPage</w:t>
+            </w:r>
+          </w:p>
+        </w:tc>
+        <w:tc>
+          <w:tcPr>
+            <w:tcW w:type="dxa" w:w="1260"/>
+          </w:tcPr>
+          <w:p>
+            <w:r>
+              <w:t>em:read</w:t>
+            </w:r>
+          </w:p>
+        </w:tc>
+        <w:tc>
+          <w:tcPr>
+            <w:tcW w:type="dxa" w:w="3240"/>
+          </w:tcPr>
+          <w:p>
+            <w:r>
+              <w:t>KPI 考核：核心指标卡与定额进度，分母缺失显示「—」</w:t>
+            </w:r>
+          </w:p>
+        </w:tc>
+      </w:tr>
     </w:tbl>
     <w:sectPr>
       <w:footerReference w:type="default" r:id="rId7"/>

</xml_diff>